<commit_message>
added the screenshot of the group participation
</commit_message>
<xml_diff>
--- a/assignments/Week03 Assignment.docx
+++ b/assignments/Week03 Assignment.docx
@@ -961,6 +961,94 @@
         <w:t xml:space="preserve"> This code shows how it constructs the blueprint of the method to get the reference of Scripture with only one verse. In other words, rather than giving access to data directly from the class, it provides the necessary details for the method in a controlled manner.</w:t>
       </w:r>
     </w:p>
+    <w:p>
+      <w:pPr>
+        <w:pStyle w:val="ListParagraph"/>
+        <w:numPr>
+          <w:ilvl w:val="0"/>
+          <w:numId w:val="2"/>
+        </w:numPr>
+      </w:pPr>
+      <w:r>
+        <w:t>Screenshot of the Group Activity Participation</w:t>
+      </w:r>
+    </w:p>
+    <w:p>
+      <w:pPr>
+        <w:pStyle w:val="ListParagraph"/>
+        <w:numPr>
+          <w:ilvl w:val="0"/>
+          <w:numId w:val="2"/>
+        </w:numPr>
+        <w:autoSpaceDE w:val="0"/>
+        <w:autoSpaceDN w:val="0"/>
+        <w:adjustRightInd w:val="0"/>
+        <w:spacing w:after="0" w:line="240" w:lineRule="auto"/>
+        <w:rPr>
+          <w:rFonts w:ascii="Helvetica Neue" w:hAnsi="Helvetica Neue" w:cs="Helvetica Neue"/>
+          <w:kern w:val="0"/>
+          <w:sz w:val="26"/>
+          <w:szCs w:val="26"/>
+          <w:lang w:val="en-US"/>
+        </w:rPr>
+      </w:pPr>
+      <w:r>
+        <w:rPr>
+          <w:noProof/>
+          <w:lang w:val="en-US"/>
+        </w:rPr>
+        <w:lastRenderedPageBreak/>
+        <w:drawing>
+          <wp:inline distT="0" distB="0" distL="0" distR="0" wp14:anchorId="653A9FE6" wp14:editId="2DA7D859">
+            <wp:extent cx="5943600" cy="3782060"/>
+            <wp:effectExtent l="0" t="0" r="0" b="2540"/>
+            <wp:docPr id="2130906008" name="Picture 1"/>
+            <wp:cNvGraphicFramePr>
+              <a:graphicFrameLocks xmlns:a="http://schemas.openxmlformats.org/drawingml/2006/main" noChangeAspect="1"/>
+            </wp:cNvGraphicFramePr>
+            <a:graphic xmlns:a="http://schemas.openxmlformats.org/drawingml/2006/main">
+              <a:graphicData uri="http://schemas.openxmlformats.org/drawingml/2006/picture">
+                <pic:pic xmlns:pic="http://schemas.openxmlformats.org/drawingml/2006/picture">
+                  <pic:nvPicPr>
+                    <pic:cNvPr id="0" name="Picture 1"/>
+                    <pic:cNvPicPr>
+                      <a:picLocks noChangeAspect="1" noChangeArrowheads="1"/>
+                    </pic:cNvPicPr>
+                  </pic:nvPicPr>
+                  <pic:blipFill>
+                    <a:blip r:embed="rId5" cstate="print">
+                      <a:extLst>
+                        <a:ext uri="{28A0092B-C50C-407E-A947-70E740481C1C}">
+                          <a14:useLocalDpi xmlns:a14="http://schemas.microsoft.com/office/drawing/2010/main" val="0"/>
+                        </a:ext>
+                      </a:extLst>
+                    </a:blip>
+                    <a:srcRect/>
+                    <a:stretch>
+                      <a:fillRect/>
+                    </a:stretch>
+                  </pic:blipFill>
+                  <pic:spPr bwMode="auto">
+                    <a:xfrm>
+                      <a:off x="0" y="0"/>
+                      <a:ext cx="5943600" cy="3782060"/>
+                    </a:xfrm>
+                    <a:prstGeom prst="rect">
+                      <a:avLst/>
+                    </a:prstGeom>
+                    <a:noFill/>
+                    <a:ln>
+                      <a:noFill/>
+                    </a:ln>
+                  </pic:spPr>
+                </pic:pic>
+              </a:graphicData>
+            </a:graphic>
+          </wp:inline>
+        </w:drawing>
+      </w:r>
+    </w:p>
+    <w:p/>
     <w:sectPr>
       <w:pgSz w:w="12240" w:h="15840"/>
       <w:pgMar w:top="1440" w:right="1440" w:bottom="1440" w:left="1440" w:header="708" w:footer="708" w:gutter="0"/>

</xml_diff>